<commit_message>
Align shared storage contract with print-folder library
</commit_message>
<xml_diff>
--- a/docs/Shared_Storage_Contract_v1.docx
+++ b/docs/Shared_Storage_Contract_v1.docx
@@ -171,17 +171,17 @@
     </w:p>
     <w:p>
       <w:r>
-        <w:t xml:space="preserve">Blue represents TO BE PRINTED. Green represents PRINTED. Blue is the existing product blue, --epx-blueignix-blue (#2378d8). Green is the existing product green, --epx-blueignix-green (#22c55e). The folder name stays visible; color is the visual treatment of that name.</w:t>
+        <w:t xml:space="preserve">Blue represents TO BE PRINTED. Green represents PRINTED. Blue is the existing product blue, --epx-blueignix-blue (#2378d8). Green is the existing product green, --epx-blueignix-green (#22c55e). Blue identifies posters that are still to be printed. Green identifies printed posters. Color applies to the folder label only. Green applies to the PRINTED label, not the folder border. Every library folder card keeps the existing blue 1px border and 0.5rem radius.</w:t>
       </w:r>
     </w:p>
     <w:p>
       <w:r>
-        <w:t xml:space="preserve">For every event, under EVENTS, the folders are &lt;Event Name&gt; TO BE PRINTED and &lt;Event Name&gt; PRINTED. &lt;Event Name&gt; in those folder names is the accepted event-folder name, including the year. These are storage folders. They do not create a second event or Reason record.</w:t>
+        <w:t xml:space="preserve">For every event, under EVENTS, the authorized physical folders are &lt;Event Name&gt; TO BE PRINTED and &lt;Event Name&gt; PRINTED. &lt;Event Name&gt; in those folder names is the accepted event-folder name, including the year. These are storage folders. They do not create a second event or Reason record. The unused folder of that pair is not created until a poster directory is placed in it.</w:t>
       </w:r>
     </w:p>
     <w:p>
       <w:r>
-        <w:t xml:space="preserve">For requests without an event, at the shared-storage root, the folders are WITHOUT-EVENT TO BE PRINTED and WITHOUT-EVENT PRINTED. Each contains the Date In year, then the poster directory.</w:t>
+        <w:t xml:space="preserve">For requests without an event, at the shared-storage root, the authorized physical folders are WITHOUT-EVENT TO BE PRINTED and WITHOUT-EVENT PRINTED. Each contains the Date In year, then the poster directory. The unused folder is not created until a poster directory is placed in it.</w:t>
       </w:r>
     </w:p>
     <w:p>
@@ -197,6 +197,11 @@
     <w:p>
       <w:r>
         <w:t xml:space="preserve">The poster directory contains the poster file and, when an Approval Sheet is present, Approval-Sheet.pdf. No placeholder, marker, or removed entry is part of the structure.</w:t>
+      </w:r>
+    </w:p>
+    <w:p>
+      <w:r>
+        <w:t xml:space="preserve">The paths in this section are physical storage paths. They are not the technician library root. There is no physical directory named EVENTS/TO BE PRINTED or EVENTS/PRINTED. Section 11 defines the four library root folders and which library paths are navigation names rather than directories.</w:t>
       </w:r>
     </w:p>
     <w:p>
@@ -422,7 +427,7 @@
     </w:p>
     <w:p>
       <w:r>
-        <w:t xml:space="preserve">Event organization remains under EVENTS. The accepted event-year name remains inside the print-folder name. WITHOUT-EVENT organization by year remains inside WITHOUT-EVENT TO BE PRINTED and WITHOUT-EVENT PRINTED. Poster ID, the poster directory name, the poster file name, and the Approval Sheet file name remain.</w:t>
+        <w:t xml:space="preserve">On disk, event organization remains under EVENTS. The accepted event-year name remains inside the print-folder name, so the physical folders are EVENTS/&lt;Event Name&gt; TO BE PRINTED and EVENTS/&lt;Event Name&gt; PRINTED. On disk, year organization remains inside WITHOUT-EVENT TO BE PRINTED and WITHOUT-EVENT PRINTED. Poster ID, the poster directory name, the poster file name, and the Approval Sheet file name remain.</w:t>
       </w:r>
     </w:p>
     <w:p>
@@ -432,12 +437,42 @@
     </w:p>
     <w:p>
       <w:r>
-        <w:t xml:space="preserve">Each request keeps one event association. The two print folders do not create a second Reason or event record. Operator configuration, role separation, and navigation among events, years, and poster directories remain. The library does not list month folders, the empty .txt artifact, drafts, or requests as poster-library destinations. The library does not list a root folder whose name is exactly WITHOUT-EVENT; that single root is the superseded migration source.</w:t>
+        <w:t xml:space="preserve">Each request keeps one event association. The two print folders do not create a second Reason or event record. Operator configuration and role separation remain. The library does not list month folders, the empty .txt artifact, drafts, or requests as poster-library destinations. The library root does not list a folder named exactly EVENTS or exactly WITHOUT-EVENT. WITHOUT-EVENT remains the superseded migration source in section 3 and is not a library root folder.</w:t>
       </w:r>
     </w:p>
     <w:p>
       <w:r>
-        <w:t xml:space="preserve">The library shows EVENTS, WITHOUT-EVENT TO BE PRINTED in blue, and WITHOUT-EVENT PRINTED in green. Inside EVENTS it shows each existing &lt;Event Name&gt; TO BE PRINTED folder in blue and each existing &lt;Event Name&gt; PRINTED folder in green. A print folder exists because a poster directory is placed in it or moved into it. This contract does not require an empty twin folder or a placeholder poster.</w:t>
+        <w:t xml:space="preserve">When the shared-storage root is available, the technician library root has four folders. Each card shows Events or Without event as its kind and TO BE PRINTED or PRINTED as its label. The breadcrumb uses the library path for that folder. It does not add a separate EVENTS or WITHOUT-EVENT level above the label.</w:t>
+      </w:r>
+    </w:p>
+    <w:p>
+      <w:r>
+        <w:t xml:space="preserve">EVENTS / TO BE PRINTED is blue. Its kind is Events and its label is TO BE PRINTED. Its library path is EVENTS TO BE PRINTED. That path is navigation only and is not a physical directory. Opening it lists each existing physical folder under EVENTS whose name is &lt;Event Name&gt; TO BE PRINTED. Inside that folder, the poster directory remains, then the poster file and the Approval Sheet when one is stored. That event-folder label is blue.</w:t>
+      </w:r>
+    </w:p>
+    <w:p>
+      <w:r>
+        <w:t xml:space="preserve">EVENTS / PRINTED is green. Its kind is Events and its label is PRINTED. Its library path is EVENTS PRINTED. That path is navigation only and is not a physical directory. Opening it lists each existing physical folder under EVENTS whose name is &lt;Event Name&gt; PRINTED. A folder named &lt;Event Name&gt; TO BE PRINTED is not listed there. Inside a printed event folder, the poster directory and its files remain. That event-folder label is green.</w:t>
+      </w:r>
+    </w:p>
+    <w:p>
+      <w:r>
+        <w:t xml:space="preserve">WITHOUT-EVENT / TO BE PRINTED is blue. Its kind is Without event and its label is TO BE PRINTED. Its library path is WITHOUT-EVENT TO BE PRINTED, and that path is the physical directory. Inside it, organization remains the Date In year, then the poster directory, then the poster file. The root label is blue. Year labels and poster-directory labels keep the ordinary label color.</w:t>
+      </w:r>
+    </w:p>
+    <w:p>
+      <w:r>
+        <w:t xml:space="preserve">WITHOUT-EVENT / PRINTED is green. Its kind is Without event and its label is PRINTED. Its library path is WITHOUT-EVENT PRINTED, and that path is the physical directory. Inside it, organization remains the Date In year, then the poster directory, then the poster file. The root label is green. Year labels and poster-directory labels keep the ordinary label color.</w:t>
+      </w:r>
+    </w:p>
+    <w:p>
+      <w:r>
+        <w:t xml:space="preserve">The four root folders are shown even when a destination has no posters. A physical print folder exists because a poster directory is placed in it or moved into it. This contract does not require an empty twin folder or a placeholder poster. When no matching event folder exists, that events library page is empty. When a WITHOUT-EVENT print directory does not exist yet, that library page is empty.</w:t>
+      </w:r>
+    </w:p>
+    <w:p>
+      <w:r>
+        <w:t xml:space="preserve">A library location whose first segment is exactly EVENTS is allowed, including the event folder and poster directory beneath it. It is not one of the four root folders. Its first page lists every physical &lt;Event Name&gt; TO BE PRINTED folder and every physical &lt;Event Name&gt; PRINTED folder under EVENTS. A library path whose first segment is exactly WITHOUT-EVENT is not a library location.</w:t>
       </w:r>
     </w:p>
     <w:p>

</xml_diff>